<commit_message>
Paper: completar marcadores de portada, registro, titularidad, participantes y uso de IA
- Portada: autor y ciudad; el script de armado ya no tiene esos datos como marcadores
- Se decide no registrar el software; la titularidad queda por definir con Logytech Mobile
- Participantes de la validación por definir con la organización
- Declaración de uso de IA con los cuatro usos reales
- Cifra de pruebas a 72; Word de las Entregas 1 y 2 reconstruidos
- Único marcador pendiente: definiciones con página de Sommerville y Bass

Co-Authored-By: Claude Sonnet 5.5 <noreply@anthropic.com>
</commit_message>
<xml_diff>
--- a/paper/Proyecto_CMEDriver_Entrega1.docx
+++ b/paper/Proyecto_CMEDriver_Entrega1.docx
@@ -118,9 +118,8 @@
           <w:rFonts w:ascii="Arial" w:cs="Arial" w:eastAsia="Arial" w:hAnsi="Arial"/>
           <w:sz w:val="22"/>
           <w:szCs w:val="22"/>
-          <w:highlight w:val="yellow"/>
-        </w:rPr>
-        <w:t xml:space="preserve">[COMPLETAR: nombre completo del estudiante]</w:t>
+        </w:rPr>
+        <w:t xml:space="preserve">Javier Esteban Mora Osorio</w:t>
       </w:r>
     </w:p>
     <w:p>
@@ -164,16 +163,7 @@
           <w:sz w:val="22"/>
           <w:szCs w:val="22"/>
         </w:rPr>
-        <w:t xml:space="preserve">Bogotá </w:t>
-      </w:r>
-      <w:r>
-        <w:rPr>
-          <w:rFonts w:ascii="Arial" w:cs="Arial" w:eastAsia="Arial" w:hAnsi="Arial"/>
-          <w:sz w:val="22"/>
-          <w:szCs w:val="22"/>
-          <w:highlight w:val="yellow"/>
-        </w:rPr>
-        <w:t xml:space="preserve">[COMPLETAR: confirmar ciudad]</w:t>
+        <w:t xml:space="preserve">Bogotá</w:t>
       </w:r>
     </w:p>
     <w:p>
@@ -218,16 +208,7 @@
           <w:sz w:val="22"/>
           <w:szCs w:val="22"/>
         </w:rPr>
-        <w:t xml:space="preserve">Autor: </w:t>
-      </w:r>
-      <w:r>
-        <w:rPr>
-          <w:rFonts w:ascii="Arial" w:cs="Arial" w:eastAsia="Arial" w:hAnsi="Arial"/>
-          <w:sz w:val="22"/>
-          <w:szCs w:val="22"/>
-          <w:highlight w:val="yellow"/>
-        </w:rPr>
-        <w:t xml:space="preserve">[COMPLETAR: nombre completo del estudiante]</w:t>
+        <w:t xml:space="preserve">Autor: Javier Esteban Mora Osorio</w:t>
       </w:r>
     </w:p>
     <w:p>

</xml_diff>